<commit_message>
Approve Phase19 publication and add university report identity
</commit_message>
<xml_diff>
--- a/deliverables/phase19_research_report_fa.docx
+++ b/deliverables/phase19_research_report_fa.docx
@@ -4,9 +4,51 @@
   <w:body>
     <w:p>
       <w:pPr>
+        <w:keepNext/>
+        <w:bidi w:val="1"/>
+        <w:spacing w:after="80" w:line="240" w:lineRule="auto"/>
+        <w:jc w:val="start"/>
+      </w:pPr>
+      <w:r>
+        <w:drawing>
+          <wp:inline xmlns:a="http://schemas.openxmlformats.org/drawingml/2006/main" xmlns:pic="http://schemas.openxmlformats.org/drawingml/2006/picture">
+            <wp:extent cx="566928" cy="865823"/>
+            <wp:docPr id="1" name="Picture 1" descr="دانشگاه آزاد اسلامی واحد کرج"/>
+            <wp:cNvGraphicFramePr>
+              <a:graphicFrameLocks noChangeAspect="1"/>
+            </wp:cNvGraphicFramePr>
+            <a:graphic>
+              <a:graphicData uri="http://schemas.openxmlformats.org/drawingml/2006/picture">
+                <pic:pic>
+                  <pic:nvPicPr>
+                    <pic:cNvPr id="0" name="iau-logo.png"/>
+                    <pic:cNvPicPr/>
+                  </pic:nvPicPr>
+                  <pic:blipFill>
+                    <a:blip r:embed="rId10"/>
+                    <a:stretch>
+                      <a:fillRect/>
+                    </a:stretch>
+                  </pic:blipFill>
+                  <pic:spPr>
+                    <a:xfrm>
+                      <a:off x="0" y="0"/>
+                      <a:ext cx="566928" cy="865823"/>
+                    </a:xfrm>
+                    <a:prstGeom prst="rect"/>
+                  </pic:spPr>
+                </pic:pic>
+              </a:graphicData>
+            </a:graphic>
+          </wp:inline>
+        </w:drawing>
+      </w:r>
+    </w:p>
+    <w:p>
+      <w:pPr>
         <w:widowControl/>
         <w:bidi w:val="1"/>
-        <w:spacing w:after="200" w:line="264" w:lineRule="auto"/>
+        <w:spacing w:after="160" w:line="264" w:lineRule="auto"/>
         <w:jc w:val="start"/>
       </w:pPr>
       <w:r>
@@ -27,7 +69,7 @@
       <w:pPr>
         <w:widowControl/>
         <w:bidi w:val="1"/>
-        <w:spacing w:after="440" w:line="264" w:lineRule="auto"/>
+        <w:spacing w:after="280" w:line="264" w:lineRule="auto"/>
         <w:jc w:val="start"/>
       </w:pPr>
       <w:r>
@@ -40,31 +82,7 @@
           <w:rtl w:val="1"/>
           <w:lang w:val="fa-IR" w:bidi="fa-IR"/>
         </w:rPr>
-        <w:t xml:space="preserve">کارشناسی مهندسی کامپیوتر  </w:t>
-      </w:r>
-      <w:r>
-        <w:rPr>
-          <w:rFonts w:ascii="DejaVu Sans" w:hAnsi="DejaVu Sans" w:cs="DejaVu Sans" w:eastAsia="DejaVu Sans"/>
-          <w:b w:val="0"/>
-          <w:color w:val="000000"/>
-          <w:sz w:val="30"/>
-          <w:szCs w:val="30"/>
-          <w:rtl w:val="0"/>
-          <w:lang w:val="en-US" w:bidi="fa-IR"/>
-        </w:rPr>
-        <w:t>|</w:t>
-      </w:r>
-      <w:r>
-        <w:rPr>
-          <w:rFonts w:ascii="B Nazanin" w:hAnsi="B Nazanin" w:cs="B Nazanin" w:eastAsia="B Nazanin"/>
-          <w:b w:val="0"/>
-          <w:color w:val="000000"/>
-          <w:sz w:val="30"/>
-          <w:szCs w:val="30"/>
-          <w:rtl w:val="1"/>
-          <w:lang w:val="fa-IR" w:bidi="fa-IR"/>
-        </w:rPr>
-        <w:t xml:space="preserve">  پروژه‌ی نرم‌افزار</w:t>
+        <w:t>درس پروژه‌ی کارشناسی مهندسی کامپیوتر</w:t>
       </w:r>
     </w:p>
     <w:p>
@@ -137,7 +155,7 @@
       <w:pPr>
         <w:widowControl/>
         <w:bidi w:val="1"/>
-        <w:spacing w:after="500" w:line="264" w:lineRule="auto"/>
+        <w:spacing w:after="360" w:line="264" w:lineRule="auto"/>
         <w:jc w:val="start"/>
       </w:pPr>
       <w:r>
@@ -262,14 +280,14 @@
       <w:pPr>
         <w:widowControl/>
         <w:bidi w:val="1"/>
-        <w:spacing w:after="240" w:line="264" w:lineRule="auto"/>
+        <w:spacing w:after="160" w:line="264" w:lineRule="auto"/>
         <w:jc w:val="start"/>
       </w:pPr>
       <w:r>
         <w:drawing>
           <wp:inline xmlns:a="http://schemas.openxmlformats.org/drawingml/2006/main" xmlns:pic="http://schemas.openxmlformats.org/drawingml/2006/picture">
-            <wp:extent cx="960120" cy="960120"/>
-            <wp:docPr id="1" name="Picture 1"/>
+            <wp:extent cx="731520" cy="731520"/>
+            <wp:docPr id="2" name="Picture 2"/>
             <wp:cNvGraphicFramePr>
               <a:graphicFrameLocks noChangeAspect="1"/>
             </wp:cNvGraphicFramePr>
@@ -281,7 +299,7 @@
                     <pic:cNvPicPr/>
                   </pic:nvPicPr>
                   <pic:blipFill>
-                    <a:blip r:embed="rId10"/>
+                    <a:blip r:embed="rId11"/>
                     <a:stretch>
                       <a:fillRect/>
                     </a:stretch>
@@ -289,7 +307,7 @@
                   <pic:spPr>
                     <a:xfrm>
                       <a:off x="0" y="0"/>
-                      <a:ext cx="960120" cy="960120"/>
+                      <a:ext cx="731520" cy="731520"/>
                     </a:xfrm>
                     <a:prstGeom prst="rect"/>
                   </pic:spPr>
@@ -5563,7 +5581,7 @@
         <w:drawing>
           <wp:inline xmlns:a="http://schemas.openxmlformats.org/drawingml/2006/main" xmlns:pic="http://schemas.openxmlformats.org/drawingml/2006/picture">
             <wp:extent cx="5577840" cy="2231136"/>
-            <wp:docPr id="2" name="Picture 2" descr="شکل ۱ مقایسه‌ی پوشش در ۱۰۲۴ واژه با سنجه‌های جداگانه"/>
+            <wp:docPr id="3" name="Picture 3" descr="شکل ۱ مقایسه‌ی پوشش در ۱۰۲۴ واژه با سنجه‌های جداگانه"/>
             <wp:cNvGraphicFramePr>
               <a:graphicFrameLocks noChangeAspect="1"/>
             </wp:cNvGraphicFramePr>
@@ -5575,7 +5593,7 @@
                     <pic:cNvPicPr/>
                   </pic:nvPicPr>
                   <pic:blipFill>
-                    <a:blip r:embed="rId11"/>
+                    <a:blip r:embed="rId12"/>
                     <a:stretch>
                       <a:fillRect/>
                     </a:stretch>
@@ -6637,7 +6655,7 @@
         <w:drawing>
           <wp:inline xmlns:a="http://schemas.openxmlformats.org/drawingml/2006/main" xmlns:pic="http://schemas.openxmlformats.org/drawingml/2006/picture">
             <wp:extent cx="5577840" cy="2231136"/>
-            <wp:docPr id="3" name="Picture 3" descr="شکل ۲ تغییر دسترسی و امکان و پوشش کامل"/>
+            <wp:docPr id="4" name="Picture 4" descr="شکل ۲ تغییر دسترسی و امکان و پوشش کامل"/>
             <wp:cNvGraphicFramePr>
               <a:graphicFrameLocks noChangeAspect="1"/>
             </wp:cNvGraphicFramePr>
@@ -6649,7 +6667,7 @@
                     <pic:cNvPicPr/>
                   </pic:nvPicPr>
                   <pic:blipFill>
-                    <a:blip r:embed="rId12"/>
+                    <a:blip r:embed="rId13"/>
                     <a:stretch>
                       <a:fillRect/>
                     </a:stretch>
@@ -7276,7 +7294,7 @@
         <w:drawing>
           <wp:inline xmlns:a="http://schemas.openxmlformats.org/drawingml/2006/main" xmlns:pic="http://schemas.openxmlformats.org/drawingml/2006/picture">
             <wp:extent cx="5577840" cy="1171346"/>
-            <wp:docPr id="4" name="Picture 4" descr="شکل ۳ فرمول انتظار دسترسی در کنترل همسان از نظر تعداد تعویض"/>
+            <wp:docPr id="5" name="Picture 5" descr="شکل ۳ فرمول انتظار دسترسی در کنترل همسان از نظر تعداد تعویض"/>
             <wp:cNvGraphicFramePr>
               <a:graphicFrameLocks noChangeAspect="1"/>
             </wp:cNvGraphicFramePr>
@@ -7288,7 +7306,7 @@
                     <pic:cNvPicPr/>
                   </pic:nvPicPr>
                   <pic:blipFill>
-                    <a:blip r:embed="rId13"/>
+                    <a:blip r:embed="rId14"/>
                     <a:stretch>
                       <a:fillRect/>
                     </a:stretch>
@@ -7995,7 +8013,7 @@
         <w:drawing>
           <wp:inline xmlns:a="http://schemas.openxmlformats.org/drawingml/2006/main" xmlns:pic="http://schemas.openxmlformats.org/drawingml/2006/picture">
             <wp:extent cx="5577840" cy="2231136"/>
-            <wp:docPr id="5" name="Picture 5" descr="شکل ۴ اثر هشت‌جلسه‌ای در هر تاریخچه"/>
+            <wp:docPr id="6" name="Picture 6" descr="شکل ۴ اثر هشت‌جلسه‌ای در هر تاریخچه"/>
             <wp:cNvGraphicFramePr>
               <a:graphicFrameLocks noChangeAspect="1"/>
             </wp:cNvGraphicFramePr>
@@ -8007,7 +8025,7 @@
                     <pic:cNvPicPr/>
                   </pic:nvPicPr>
                   <pic:blipFill>
-                    <a:blip r:embed="rId14"/>
+                    <a:blip r:embed="rId15"/>
                     <a:stretch>
                       <a:fillRect/>
                     </a:stretch>

</xml_diff>